<commit_message>
Aplicar formato APA a las figuras de los anexos
</commit_message>
<xml_diff>
--- a/Practico_experimental2/Informe/Informe_Practica_02_Formato_Oficial.docx
+++ b/Practico_experimental2/Informe/Informe_Practica_02_Formato_Oficial.docx
@@ -2325,460 +2325,1153 @@
               <w:t>Evidencias del flujo real de ejecución</w:t>
             </w:r>
           </w:p>
+          <w:tbl>
+            <w:tblPr>
+              <w:tblStyle w:val="5"/>
+              <w:tblW w:w="6480" w:type="dxa"/>
+              <w:tblInd w:w="0" w:type="dxa"/>
+              <w:tblBorders>
+                <w:top w:val="none" w:color="auto" w:sz="0" w:space="0"/>
+                <w:left w:val="none" w:color="auto" w:sz="0" w:space="0"/>
+                <w:bottom w:val="none" w:color="auto" w:sz="0" w:space="0"/>
+                <w:right w:val="none" w:color="auto" w:sz="0" w:space="0"/>
+                <w:insideH w:val="none" w:color="auto" w:sz="0" w:space="0"/>
+                <w:insideV w:val="none" w:color="auto" w:sz="0" w:space="0"/>
+              </w:tblBorders>
+              <w:tblLayout w:type="fixed"/>
+              <w:tblCellMar>
+                <w:top w:w="0" w:type="dxa"/>
+                <w:left w:w="108" w:type="dxa"/>
+                <w:bottom w:w="0" w:type="dxa"/>
+                <w:right w:w="108" w:type="dxa"/>
+              </w:tblCellMar>
+            </w:tblPr>
+            <w:tblGrid>
+              <w:gridCol w:w="6480"/>
+            </w:tblGrid>
+            <w:tr>
+              <w:tblPrEx>
+                <w:tblBorders>
+                  <w:top w:val="none" w:color="auto" w:sz="0" w:space="0"/>
+                  <w:left w:val="none" w:color="auto" w:sz="0" w:space="0"/>
+                  <w:bottom w:val="none" w:color="auto" w:sz="0" w:space="0"/>
+                  <w:right w:val="none" w:color="auto" w:sz="0" w:space="0"/>
+                  <w:insideH w:val="none" w:color="auto" w:sz="0" w:space="0"/>
+                  <w:insideV w:val="none" w:color="auto" w:sz="0" w:space="0"/>
+                </w:tblBorders>
+                <w:tblCellMar>
+                  <w:top w:w="0" w:type="dxa"/>
+                  <w:left w:w="108" w:type="dxa"/>
+                  <w:bottom w:w="0" w:type="dxa"/>
+                  <w:right w:w="108" w:type="dxa"/>
+                </w:tblCellMar>
+              </w:tblPrEx>
+              <w:trPr>
+                <w:cantSplit/>
+              </w:trPr>
+              <w:tc>
+                <w:tcPr>
+                  <w:tcW w:w="6480" w:type="dxa"/>
+                  <w:tcMar>
+                    <w:top w:w="0" w:type="dxa"/>
+                    <w:left w:w="0" w:type="dxa"/>
+                    <w:bottom w:w="0" w:type="dxa"/>
+                    <w:right w:w="0" w:type="dxa"/>
+                  </w:tcMar>
+                </w:tcPr>
+                <w:p>
+                  <w:pPr>
+                    <w:keepNext/>
+                    <w:spacing w:before="120" w:after="0"/>
+                    <w:jc w:val="center"/>
+                  </w:pPr>
+                  <w:r>
+                    <w:rPr>
+                      <w:rFonts w:ascii="Book Antiqua" w:hAnsi="Book Antiqua" w:eastAsia="Book Antiqua"/>
+                      <w:b/>
+                      <w:i w:val="0"/>
+                      <w:sz w:val="19"/>
+                    </w:rPr>
+                    <w:t>Figura 1.</w:t>
+                  </w:r>
+                </w:p>
+                <w:p>
+                  <w:pPr>
+                    <w:keepNext/>
+                    <w:spacing w:after="60"/>
+                    <w:jc w:val="center"/>
+                  </w:pPr>
+                  <w:r>
+                    <w:rPr>
+                      <w:rFonts w:ascii="Book Antiqua" w:hAnsi="Book Antiqua" w:eastAsia="Book Antiqua"/>
+                      <w:b w:val="0"/>
+                      <w:i/>
+                      <w:sz w:val="19"/>
+                    </w:rPr>
+                    <w:t>Definición de la clase PaginaWeb y menú principal del sistema</w:t>
+                  </w:r>
+                </w:p>
+                <w:p>
+                  <w:pPr>
+                    <w:keepNext/>
+                    <w:spacing w:after="60"/>
+                    <w:jc w:val="center"/>
+                  </w:pPr>
+                  <w:r>
+                    <w:drawing>
+                      <wp:inline distT="0" distB="0" distL="114300" distR="114300">
+                        <wp:extent cx="4114800" cy="2184400"/>
+                        <wp:effectExtent l="0" t="0" r="0" b="6350"/>
+                        <wp:docPr id="1" name="Picture 1"/>
+                        <wp:cNvGraphicFramePr>
+                          <a:graphicFrameLocks xmlns:a="http://schemas.openxmlformats.org/drawingml/2006/main" noChangeAspect="1"/>
+                        </wp:cNvGraphicFramePr>
+                        <a:graphic xmlns:a="http://schemas.openxmlformats.org/drawingml/2006/main">
+                          <a:graphicData uri="http://schemas.openxmlformats.org/drawingml/2006/picture">
+                            <pic:pic xmlns:pic="http://schemas.openxmlformats.org/drawingml/2006/picture">
+                              <pic:nvPicPr>
+                                <pic:cNvPr id="1" name="Picture 1"/>
+                                <pic:cNvPicPr>
+                                  <a:picLocks noChangeAspect="1"/>
+                                </pic:cNvPicPr>
+                              </pic:nvPicPr>
+                              <pic:blipFill>
+                                <a:blip r:embed="rId9"/>
+                                <a:stretch>
+                                  <a:fillRect/>
+                                </a:stretch>
+                              </pic:blipFill>
+                              <pic:spPr>
+                                <a:xfrm>
+                                  <a:off x="0" y="0"/>
+                                  <a:ext cx="4114800" cy="2184475"/>
+                                </a:xfrm>
+                                <a:prstGeom prst="rect">
+                                  <a:avLst/>
+                                </a:prstGeom>
+                              </pic:spPr>
+                            </pic:pic>
+                          </a:graphicData>
+                        </a:graphic>
+                      </wp:inline>
+                    </w:drawing>
+                  </w:r>
+                </w:p>
+                <w:p>
+                  <w:pPr>
+                    <w:keepLines/>
+                    <w:spacing w:after="160"/>
+                    <w:jc w:val="center"/>
+                  </w:pPr>
+                  <w:r>
+                    <w:rPr>
+                      <w:rFonts w:ascii="Book Antiqua" w:hAnsi="Book Antiqua" w:eastAsia="Book Antiqua"/>
+                      <w:b/>
+                      <w:i/>
+                      <w:sz w:val="18"/>
+                    </w:rPr>
+                    <w:t xml:space="preserve">Nota. </w:t>
+                  </w:r>
+                  <w:r>
+                    <w:rPr>
+                      <w:rFonts w:ascii="Book Antiqua" w:hAnsi="Book Antiqua" w:eastAsia="Book Antiqua"/>
+                      <w:b w:val="0"/>
+                      <w:i w:val="0"/>
+                      <w:sz w:val="18"/>
+                    </w:rPr>
+                    <w:t>Captura de pantalla de elaboración propia realizada en Visual Studio Code (2026).</w:t>
+                  </w:r>
+                </w:p>
+              </w:tc>
+            </w:tr>
+          </w:tbl>
+          <w:p/>
           <w:p>
-            <w:pPr>
-              <w:keepNext/>
-              <w:spacing w:before="80" w:after="60"/>
-              <w:jc w:val="center"/>
-            </w:pPr>
-            <w:r>
-              <w:drawing>
-                <wp:inline distT="0" distB="0" distL="114300" distR="114300">
-                  <wp:extent cx="5440680" cy="2887980"/>
-                  <wp:effectExtent l="0" t="0" r="7620" b="7620"/>
-                  <wp:docPr id="1" name="Picture 1"/>
-                  <wp:cNvGraphicFramePr>
-                    <a:graphicFrameLocks xmlns:a="http://schemas.openxmlformats.org/drawingml/2006/main" noChangeAspect="1"/>
-                  </wp:cNvGraphicFramePr>
-                  <a:graphic xmlns:a="http://schemas.openxmlformats.org/drawingml/2006/main">
-                    <a:graphicData uri="http://schemas.openxmlformats.org/drawingml/2006/picture">
-                      <pic:pic xmlns:pic="http://schemas.openxmlformats.org/drawingml/2006/picture">
-                        <pic:nvPicPr>
-                          <pic:cNvPr id="1" name="Picture 1"/>
-                          <pic:cNvPicPr>
-                            <a:picLocks noChangeAspect="1"/>
-                          </pic:cNvPicPr>
-                        </pic:nvPicPr>
-                        <pic:blipFill>
-                          <a:blip r:embed="rId9"/>
-                          <a:stretch>
-                            <a:fillRect/>
-                          </a:stretch>
-                        </pic:blipFill>
-                        <pic:spPr>
-                          <a:xfrm>
-                            <a:off x="0" y="0"/>
-                            <a:ext cx="5440680" cy="2888361"/>
-                          </a:xfrm>
-                          <a:prstGeom prst="rect">
-                            <a:avLst/>
-                          </a:prstGeom>
-                        </pic:spPr>
-                      </pic:pic>
-                    </a:graphicData>
-                  </a:graphic>
-                </wp:inline>
-              </w:drawing>
+            <w:r>
+              <w:br w:type="page"/>
             </w:r>
           </w:p>
+          <w:tbl>
+            <w:tblPr>
+              <w:tblStyle w:val="5"/>
+              <w:tblW w:w="6480" w:type="dxa"/>
+              <w:tblInd w:w="0" w:type="dxa"/>
+              <w:tblBorders>
+                <w:top w:val="none" w:color="auto" w:sz="0" w:space="0"/>
+                <w:left w:val="none" w:color="auto" w:sz="0" w:space="0"/>
+                <w:bottom w:val="none" w:color="auto" w:sz="0" w:space="0"/>
+                <w:right w:val="none" w:color="auto" w:sz="0" w:space="0"/>
+                <w:insideH w:val="none" w:color="auto" w:sz="0" w:space="0"/>
+                <w:insideV w:val="none" w:color="auto" w:sz="0" w:space="0"/>
+              </w:tblBorders>
+              <w:tblLayout w:type="fixed"/>
+              <w:tblCellMar>
+                <w:top w:w="0" w:type="dxa"/>
+                <w:left w:w="108" w:type="dxa"/>
+                <w:bottom w:w="0" w:type="dxa"/>
+                <w:right w:w="108" w:type="dxa"/>
+              </w:tblCellMar>
+            </w:tblPr>
+            <w:tblGrid>
+              <w:gridCol w:w="6480"/>
+            </w:tblGrid>
+            <w:tr>
+              <w:tblPrEx>
+                <w:tblBorders>
+                  <w:top w:val="none" w:color="auto" w:sz="0" w:space="0"/>
+                  <w:left w:val="none" w:color="auto" w:sz="0" w:space="0"/>
+                  <w:bottom w:val="none" w:color="auto" w:sz="0" w:space="0"/>
+                  <w:right w:val="none" w:color="auto" w:sz="0" w:space="0"/>
+                  <w:insideH w:val="none" w:color="auto" w:sz="0" w:space="0"/>
+                  <w:insideV w:val="none" w:color="auto" w:sz="0" w:space="0"/>
+                </w:tblBorders>
+                <w:tblCellMar>
+                  <w:top w:w="0" w:type="dxa"/>
+                  <w:left w:w="108" w:type="dxa"/>
+                  <w:bottom w:w="0" w:type="dxa"/>
+                  <w:right w:w="108" w:type="dxa"/>
+                </w:tblCellMar>
+              </w:tblPrEx>
+              <w:trPr>
+                <w:cantSplit/>
+              </w:trPr>
+              <w:tc>
+                <w:tcPr>
+                  <w:tcW w:w="6480" w:type="dxa"/>
+                  <w:tcMar>
+                    <w:top w:w="0" w:type="dxa"/>
+                    <w:left w:w="0" w:type="dxa"/>
+                    <w:bottom w:w="0" w:type="dxa"/>
+                    <w:right w:w="0" w:type="dxa"/>
+                  </w:tcMar>
+                </w:tcPr>
+                <w:p>
+                  <w:pPr>
+                    <w:keepNext/>
+                    <w:spacing w:before="120" w:after="0"/>
+                    <w:jc w:val="center"/>
+                  </w:pPr>
+                  <w:r>
+                    <w:rPr>
+                      <w:rFonts w:ascii="Book Antiqua" w:hAnsi="Book Antiqua" w:eastAsia="Book Antiqua"/>
+                      <w:b/>
+                      <w:i w:val="0"/>
+                      <w:sz w:val="19"/>
+                    </w:rPr>
+                    <w:t>Figura 2.</w:t>
+                  </w:r>
+                </w:p>
+                <w:p>
+                  <w:pPr>
+                    <w:keepNext/>
+                    <w:spacing w:after="60"/>
+                    <w:jc w:val="center"/>
+                  </w:pPr>
+                  <w:r>
+                    <w:rPr>
+                      <w:rFonts w:ascii="Book Antiqua" w:hAnsi="Book Antiqua" w:eastAsia="Book Antiqua"/>
+                      <w:b w:val="0"/>
+                      <w:i/>
+                      <w:sz w:val="19"/>
+                    </w:rPr>
+                    <w:t>Visualización del historial de navegación mediante una pila LIFO</w:t>
+                  </w:r>
+                </w:p>
+                <w:p>
+                  <w:pPr>
+                    <w:keepNext/>
+                    <w:spacing w:after="60"/>
+                    <w:jc w:val="center"/>
+                  </w:pPr>
+                  <w:r>
+                    <w:drawing>
+                      <wp:inline distT="0" distB="0" distL="114300" distR="114300">
+                        <wp:extent cx="4114800" cy="1960880"/>
+                        <wp:effectExtent l="0" t="0" r="0" b="1270"/>
+                        <wp:docPr id="2" name="Picture 2"/>
+                        <wp:cNvGraphicFramePr>
+                          <a:graphicFrameLocks xmlns:a="http://schemas.openxmlformats.org/drawingml/2006/main" noChangeAspect="1"/>
+                        </wp:cNvGraphicFramePr>
+                        <a:graphic xmlns:a="http://schemas.openxmlformats.org/drawingml/2006/main">
+                          <a:graphicData uri="http://schemas.openxmlformats.org/drawingml/2006/picture">
+                            <pic:pic xmlns:pic="http://schemas.openxmlformats.org/drawingml/2006/picture">
+                              <pic:nvPicPr>
+                                <pic:cNvPr id="2" name="Picture 2"/>
+                                <pic:cNvPicPr>
+                                  <a:picLocks noChangeAspect="1"/>
+                                </pic:cNvPicPr>
+                              </pic:nvPicPr>
+                              <pic:blipFill>
+                                <a:blip r:embed="rId10"/>
+                                <a:stretch>
+                                  <a:fillRect/>
+                                </a:stretch>
+                              </pic:blipFill>
+                              <pic:spPr>
+                                <a:xfrm>
+                                  <a:off x="0" y="0"/>
+                                  <a:ext cx="4114800" cy="1961096"/>
+                                </a:xfrm>
+                                <a:prstGeom prst="rect">
+                                  <a:avLst/>
+                                </a:prstGeom>
+                              </pic:spPr>
+                            </pic:pic>
+                          </a:graphicData>
+                        </a:graphic>
+                      </wp:inline>
+                    </w:drawing>
+                  </w:r>
+                </w:p>
+                <w:p>
+                  <w:pPr>
+                    <w:keepLines/>
+                    <w:spacing w:after="160"/>
+                    <w:jc w:val="center"/>
+                  </w:pPr>
+                  <w:r>
+                    <w:rPr>
+                      <w:rFonts w:ascii="Book Antiqua" w:hAnsi="Book Antiqua" w:eastAsia="Book Antiqua"/>
+                      <w:b/>
+                      <w:i/>
+                      <w:sz w:val="18"/>
+                    </w:rPr>
+                    <w:t xml:space="preserve">Nota. </w:t>
+                  </w:r>
+                  <w:r>
+                    <w:rPr>
+                      <w:rFonts w:ascii="Book Antiqua" w:hAnsi="Book Antiqua" w:eastAsia="Book Antiqua"/>
+                      <w:b w:val="0"/>
+                      <w:i w:val="0"/>
+                      <w:sz w:val="18"/>
+                    </w:rPr>
+                    <w:t>La captura muestra las páginas almacenadas en orden LIFO. Elaboración propia en Visual Studio Code (2026).</w:t>
+                  </w:r>
+                </w:p>
+              </w:tc>
+            </w:tr>
+          </w:tbl>
+          <w:p/>
+          <w:tbl>
+            <w:tblPr>
+              <w:tblStyle w:val="5"/>
+              <w:tblW w:w="6480" w:type="dxa"/>
+              <w:tblInd w:w="0" w:type="dxa"/>
+              <w:tblBorders>
+                <w:top w:val="none" w:color="auto" w:sz="0" w:space="0"/>
+                <w:left w:val="none" w:color="auto" w:sz="0" w:space="0"/>
+                <w:bottom w:val="none" w:color="auto" w:sz="0" w:space="0"/>
+                <w:right w:val="none" w:color="auto" w:sz="0" w:space="0"/>
+                <w:insideH w:val="none" w:color="auto" w:sz="0" w:space="0"/>
+                <w:insideV w:val="none" w:color="auto" w:sz="0" w:space="0"/>
+              </w:tblBorders>
+              <w:tblLayout w:type="fixed"/>
+              <w:tblCellMar>
+                <w:top w:w="0" w:type="dxa"/>
+                <w:left w:w="108" w:type="dxa"/>
+                <w:bottom w:w="0" w:type="dxa"/>
+                <w:right w:w="108" w:type="dxa"/>
+              </w:tblCellMar>
+            </w:tblPr>
+            <w:tblGrid>
+              <w:gridCol w:w="6480"/>
+            </w:tblGrid>
+            <w:tr>
+              <w:tblPrEx>
+                <w:tblBorders>
+                  <w:top w:val="none" w:color="auto" w:sz="0" w:space="0"/>
+                  <w:left w:val="none" w:color="auto" w:sz="0" w:space="0"/>
+                  <w:bottom w:val="none" w:color="auto" w:sz="0" w:space="0"/>
+                  <w:right w:val="none" w:color="auto" w:sz="0" w:space="0"/>
+                  <w:insideH w:val="none" w:color="auto" w:sz="0" w:space="0"/>
+                  <w:insideV w:val="none" w:color="auto" w:sz="0" w:space="0"/>
+                </w:tblBorders>
+                <w:tblCellMar>
+                  <w:top w:w="0" w:type="dxa"/>
+                  <w:left w:w="108" w:type="dxa"/>
+                  <w:bottom w:w="0" w:type="dxa"/>
+                  <w:right w:w="108" w:type="dxa"/>
+                </w:tblCellMar>
+              </w:tblPrEx>
+              <w:trPr>
+                <w:cantSplit/>
+              </w:trPr>
+              <w:tc>
+                <w:tcPr>
+                  <w:tcW w:w="6480" w:type="dxa"/>
+                  <w:tcMar>
+                    <w:top w:w="0" w:type="dxa"/>
+                    <w:left w:w="0" w:type="dxa"/>
+                    <w:bottom w:w="0" w:type="dxa"/>
+                    <w:right w:w="0" w:type="dxa"/>
+                  </w:tcMar>
+                </w:tcPr>
+                <w:p>
+                  <w:pPr>
+                    <w:keepNext/>
+                    <w:spacing w:before="120" w:after="0"/>
+                    <w:jc w:val="center"/>
+                  </w:pPr>
+                  <w:r>
+                    <w:rPr>
+                      <w:rFonts w:ascii="Book Antiqua" w:hAnsi="Book Antiqua" w:eastAsia="Book Antiqua"/>
+                      <w:b/>
+                      <w:i w:val="0"/>
+                      <w:sz w:val="19"/>
+                    </w:rPr>
+                    <w:t>Figura 3.</w:t>
+                  </w:r>
+                </w:p>
+                <w:p>
+                  <w:pPr>
+                    <w:keepNext/>
+                    <w:spacing w:after="60"/>
+                    <w:jc w:val="center"/>
+                  </w:pPr>
+                  <w:r>
+                    <w:rPr>
+                      <w:rFonts w:ascii="Book Antiqua" w:hAnsi="Book Antiqua" w:eastAsia="Book Antiqua"/>
+                      <w:b w:val="0"/>
+                      <w:i/>
+                      <w:sz w:val="19"/>
+                    </w:rPr>
+                    <w:t>Consulta de una página almacenada en la pila</w:t>
+                  </w:r>
+                </w:p>
+                <w:p>
+                  <w:pPr>
+                    <w:keepNext/>
+                    <w:spacing w:after="60"/>
+                    <w:jc w:val="center"/>
+                  </w:pPr>
+                  <w:r>
+                    <w:drawing>
+                      <wp:inline distT="0" distB="0" distL="114300" distR="114300">
+                        <wp:extent cx="4114800" cy="2100580"/>
+                        <wp:effectExtent l="0" t="0" r="0" b="13970"/>
+                        <wp:docPr id="3" name="Picture 3"/>
+                        <wp:cNvGraphicFramePr>
+                          <a:graphicFrameLocks xmlns:a="http://schemas.openxmlformats.org/drawingml/2006/main" noChangeAspect="1"/>
+                        </wp:cNvGraphicFramePr>
+                        <a:graphic xmlns:a="http://schemas.openxmlformats.org/drawingml/2006/main">
+                          <a:graphicData uri="http://schemas.openxmlformats.org/drawingml/2006/picture">
+                            <pic:pic xmlns:pic="http://schemas.openxmlformats.org/drawingml/2006/picture">
+                              <pic:nvPicPr>
+                                <pic:cNvPr id="3" name="Picture 3"/>
+                                <pic:cNvPicPr>
+                                  <a:picLocks noChangeAspect="1"/>
+                                </pic:cNvPicPr>
+                              </pic:nvPicPr>
+                              <pic:blipFill>
+                                <a:blip r:embed="rId11"/>
+                                <a:stretch>
+                                  <a:fillRect/>
+                                </a:stretch>
+                              </pic:blipFill>
+                              <pic:spPr>
+                                <a:xfrm>
+                                  <a:off x="0" y="0"/>
+                                  <a:ext cx="4114800" cy="2101174"/>
+                                </a:xfrm>
+                                <a:prstGeom prst="rect">
+                                  <a:avLst/>
+                                </a:prstGeom>
+                              </pic:spPr>
+                            </pic:pic>
+                          </a:graphicData>
+                        </a:graphic>
+                      </wp:inline>
+                    </w:drawing>
+                  </w:r>
+                </w:p>
+                <w:p>
+                  <w:pPr>
+                    <w:keepLines/>
+                    <w:spacing w:after="160"/>
+                    <w:jc w:val="center"/>
+                  </w:pPr>
+                  <w:r>
+                    <w:rPr>
+                      <w:rFonts w:ascii="Book Antiqua" w:hAnsi="Book Antiqua" w:eastAsia="Book Antiqua"/>
+                      <w:b/>
+                      <w:i/>
+                      <w:sz w:val="18"/>
+                    </w:rPr>
+                    <w:t xml:space="preserve">Nota. </w:t>
+                  </w:r>
+                  <w:r>
+                    <w:rPr>
+                      <w:rFonts w:ascii="Book Antiqua" w:hAnsi="Book Antiqua" w:eastAsia="Book Antiqua"/>
+                      <w:b w:val="0"/>
+                      <w:i w:val="0"/>
+                      <w:sz w:val="18"/>
+                    </w:rPr>
+                    <w:t>Resultado de la búsqueda de Microsoft Learn dentro del historial de retroceso. Elaboración propia (2026).</w:t>
+                  </w:r>
+                </w:p>
+              </w:tc>
+            </w:tr>
+          </w:tbl>
+          <w:p/>
           <w:p>
-            <w:pPr>
-              <w:keepLines/>
-              <w:spacing w:after="160"/>
-              <w:jc w:val="center"/>
-            </w:pPr>
-            <w:r>
-              <w:rPr>
-                <w:rFonts w:ascii="Book Antiqua" w:hAnsi="Book Antiqua" w:eastAsia="Book Antiqua"/>
-                <w:b w:val="0"/>
-                <w:i/>
-                <w:sz w:val="19"/>
-              </w:rPr>
-              <w:t>Anexo 1. Clase PaginaWeb y menú final del sistema.</w:t>
+            <w:r>
+              <w:br w:type="page"/>
             </w:r>
           </w:p>
+          <w:tbl>
+            <w:tblPr>
+              <w:tblStyle w:val="5"/>
+              <w:tblW w:w="6480" w:type="dxa"/>
+              <w:tblInd w:w="0" w:type="dxa"/>
+              <w:tblBorders>
+                <w:top w:val="none" w:color="auto" w:sz="0" w:space="0"/>
+                <w:left w:val="none" w:color="auto" w:sz="0" w:space="0"/>
+                <w:bottom w:val="none" w:color="auto" w:sz="0" w:space="0"/>
+                <w:right w:val="none" w:color="auto" w:sz="0" w:space="0"/>
+                <w:insideH w:val="none" w:color="auto" w:sz="0" w:space="0"/>
+                <w:insideV w:val="none" w:color="auto" w:sz="0" w:space="0"/>
+              </w:tblBorders>
+              <w:tblLayout w:type="fixed"/>
+              <w:tblCellMar>
+                <w:top w:w="0" w:type="dxa"/>
+                <w:left w:w="108" w:type="dxa"/>
+                <w:bottom w:w="0" w:type="dxa"/>
+                <w:right w:w="108" w:type="dxa"/>
+              </w:tblCellMar>
+            </w:tblPr>
+            <w:tblGrid>
+              <w:gridCol w:w="6480"/>
+            </w:tblGrid>
+            <w:tr>
+              <w:tblPrEx>
+                <w:tblBorders>
+                  <w:top w:val="none" w:color="auto" w:sz="0" w:space="0"/>
+                  <w:left w:val="none" w:color="auto" w:sz="0" w:space="0"/>
+                  <w:bottom w:val="none" w:color="auto" w:sz="0" w:space="0"/>
+                  <w:right w:val="none" w:color="auto" w:sz="0" w:space="0"/>
+                  <w:insideH w:val="none" w:color="auto" w:sz="0" w:space="0"/>
+                  <w:insideV w:val="none" w:color="auto" w:sz="0" w:space="0"/>
+                </w:tblBorders>
+                <w:tblCellMar>
+                  <w:top w:w="0" w:type="dxa"/>
+                  <w:left w:w="108" w:type="dxa"/>
+                  <w:bottom w:w="0" w:type="dxa"/>
+                  <w:right w:w="108" w:type="dxa"/>
+                </w:tblCellMar>
+              </w:tblPrEx>
+              <w:trPr>
+                <w:cantSplit/>
+              </w:trPr>
+              <w:tc>
+                <w:tcPr>
+                  <w:tcW w:w="6480" w:type="dxa"/>
+                  <w:tcMar>
+                    <w:top w:w="0" w:type="dxa"/>
+                    <w:left w:w="0" w:type="dxa"/>
+                    <w:bottom w:w="0" w:type="dxa"/>
+                    <w:right w:w="0" w:type="dxa"/>
+                  </w:tcMar>
+                </w:tcPr>
+                <w:p>
+                  <w:pPr>
+                    <w:keepNext/>
+                    <w:spacing w:before="120" w:after="0"/>
+                    <w:jc w:val="center"/>
+                  </w:pPr>
+                  <w:r>
+                    <w:rPr>
+                      <w:rFonts w:ascii="Book Antiqua" w:hAnsi="Book Antiqua" w:eastAsia="Book Antiqua"/>
+                      <w:b/>
+                      <w:i w:val="0"/>
+                      <w:sz w:val="19"/>
+                    </w:rPr>
+                    <w:t>Figura 4.</w:t>
+                  </w:r>
+                </w:p>
+                <w:p>
+                  <w:pPr>
+                    <w:keepNext/>
+                    <w:spacing w:after="60"/>
+                    <w:jc w:val="center"/>
+                  </w:pPr>
+                  <w:r>
+                    <w:rPr>
+                      <w:rFonts w:ascii="Book Antiqua" w:hAnsi="Book Antiqua" w:eastAsia="Book Antiqua"/>
+                      <w:b w:val="0"/>
+                      <w:i/>
+                      <w:sz w:val="19"/>
+                    </w:rPr>
+                    <w:t>Reporte completo de las páginas visitadas</w:t>
+                  </w:r>
+                </w:p>
+                <w:p>
+                  <w:pPr>
+                    <w:keepNext/>
+                    <w:spacing w:after="60"/>
+                    <w:jc w:val="center"/>
+                  </w:pPr>
+                  <w:r>
+                    <w:drawing>
+                      <wp:inline distT="0" distB="0" distL="114300" distR="114300">
+                        <wp:extent cx="4114800" cy="1951990"/>
+                        <wp:effectExtent l="0" t="0" r="0" b="10160"/>
+                        <wp:docPr id="4" name="Picture 4"/>
+                        <wp:cNvGraphicFramePr>
+                          <a:graphicFrameLocks xmlns:a="http://schemas.openxmlformats.org/drawingml/2006/main" noChangeAspect="1"/>
+                        </wp:cNvGraphicFramePr>
+                        <a:graphic xmlns:a="http://schemas.openxmlformats.org/drawingml/2006/main">
+                          <a:graphicData uri="http://schemas.openxmlformats.org/drawingml/2006/picture">
+                            <pic:pic xmlns:pic="http://schemas.openxmlformats.org/drawingml/2006/picture">
+                              <pic:nvPicPr>
+                                <pic:cNvPr id="4" name="Picture 4"/>
+                                <pic:cNvPicPr>
+                                  <a:picLocks noChangeAspect="1"/>
+                                </pic:cNvPicPr>
+                              </pic:nvPicPr>
+                              <pic:blipFill>
+                                <a:blip r:embed="rId12"/>
+                                <a:stretch>
+                                  <a:fillRect/>
+                                </a:stretch>
+                              </pic:blipFill>
+                              <pic:spPr>
+                                <a:xfrm>
+                                  <a:off x="0" y="0"/>
+                                  <a:ext cx="4114800" cy="1952085"/>
+                                </a:xfrm>
+                                <a:prstGeom prst="rect">
+                                  <a:avLst/>
+                                </a:prstGeom>
+                              </pic:spPr>
+                            </pic:pic>
+                          </a:graphicData>
+                        </a:graphic>
+                      </wp:inline>
+                    </w:drawing>
+                  </w:r>
+                </w:p>
+                <w:p>
+                  <w:pPr>
+                    <w:keepLines/>
+                    <w:spacing w:after="160"/>
+                    <w:jc w:val="center"/>
+                  </w:pPr>
+                  <w:r>
+                    <w:rPr>
+                      <w:rFonts w:ascii="Book Antiqua" w:hAnsi="Book Antiqua" w:eastAsia="Book Antiqua"/>
+                      <w:b/>
+                      <w:i/>
+                      <w:sz w:val="18"/>
+                    </w:rPr>
+                    <w:t xml:space="preserve">Nota. </w:t>
+                  </w:r>
+                  <w:r>
+                    <w:rPr>
+                      <w:rFonts w:ascii="Book Antiqua" w:hAnsi="Book Antiqua" w:eastAsia="Book Antiqua"/>
+                      <w:b w:val="0"/>
+                      <w:i w:val="0"/>
+                      <w:sz w:val="18"/>
+                    </w:rPr>
+                    <w:t>El reporte presenta el título, la URL, la categoría y la fecha de visita de cada página registrada. Elaboración propia (2026).</w:t>
+                  </w:r>
+                </w:p>
+              </w:tc>
+            </w:tr>
+          </w:tbl>
+          <w:p/>
           <w:p>
             <w:r>
               <w:br w:type="page"/>
             </w:r>
           </w:p>
+          <w:tbl>
+            <w:tblPr>
+              <w:tblStyle w:val="5"/>
+              <w:tblW w:w="6480" w:type="dxa"/>
+              <w:tblInd w:w="0" w:type="dxa"/>
+              <w:tblBorders>
+                <w:top w:val="none" w:color="auto" w:sz="0" w:space="0"/>
+                <w:left w:val="none" w:color="auto" w:sz="0" w:space="0"/>
+                <w:bottom w:val="none" w:color="auto" w:sz="0" w:space="0"/>
+                <w:right w:val="none" w:color="auto" w:sz="0" w:space="0"/>
+                <w:insideH w:val="none" w:color="auto" w:sz="0" w:space="0"/>
+                <w:insideV w:val="none" w:color="auto" w:sz="0" w:space="0"/>
+              </w:tblBorders>
+              <w:tblLayout w:type="fixed"/>
+              <w:tblCellMar>
+                <w:top w:w="0" w:type="dxa"/>
+                <w:left w:w="108" w:type="dxa"/>
+                <w:bottom w:w="0" w:type="dxa"/>
+                <w:right w:w="108" w:type="dxa"/>
+              </w:tblCellMar>
+            </w:tblPr>
+            <w:tblGrid>
+              <w:gridCol w:w="6480"/>
+            </w:tblGrid>
+            <w:tr>
+              <w:tblPrEx>
+                <w:tblBorders>
+                  <w:top w:val="none" w:color="auto" w:sz="0" w:space="0"/>
+                  <w:left w:val="none" w:color="auto" w:sz="0" w:space="0"/>
+                  <w:bottom w:val="none" w:color="auto" w:sz="0" w:space="0"/>
+                  <w:right w:val="none" w:color="auto" w:sz="0" w:space="0"/>
+                  <w:insideH w:val="none" w:color="auto" w:sz="0" w:space="0"/>
+                  <w:insideV w:val="none" w:color="auto" w:sz="0" w:space="0"/>
+                </w:tblBorders>
+                <w:tblCellMar>
+                  <w:top w:w="0" w:type="dxa"/>
+                  <w:left w:w="108" w:type="dxa"/>
+                  <w:bottom w:w="0" w:type="dxa"/>
+                  <w:right w:w="108" w:type="dxa"/>
+                </w:tblCellMar>
+              </w:tblPrEx>
+              <w:trPr>
+                <w:cantSplit/>
+              </w:trPr>
+              <w:tc>
+                <w:tcPr>
+                  <w:tcW w:w="6480" w:type="dxa"/>
+                  <w:tcMar>
+                    <w:top w:w="0" w:type="dxa"/>
+                    <w:left w:w="0" w:type="dxa"/>
+                    <w:bottom w:w="0" w:type="dxa"/>
+                    <w:right w:w="0" w:type="dxa"/>
+                  </w:tcMar>
+                </w:tcPr>
+                <w:p>
+                  <w:pPr>
+                    <w:keepNext/>
+                    <w:spacing w:before="120" w:after="0"/>
+                    <w:jc w:val="center"/>
+                  </w:pPr>
+                  <w:r>
+                    <w:rPr>
+                      <w:rFonts w:ascii="Book Antiqua" w:hAnsi="Book Antiqua" w:eastAsia="Book Antiqua"/>
+                      <w:b/>
+                      <w:i w:val="0"/>
+                      <w:sz w:val="19"/>
+                    </w:rPr>
+                    <w:t>Figura 5.</w:t>
+                  </w:r>
+                </w:p>
+                <w:p>
+                  <w:pPr>
+                    <w:keepNext/>
+                    <w:spacing w:after="60"/>
+                    <w:jc w:val="center"/>
+                  </w:pPr>
+                  <w:r>
+                    <w:rPr>
+                      <w:rFonts w:ascii="Book Antiqua" w:hAnsi="Book Antiqua" w:eastAsia="Book Antiqua"/>
+                      <w:b w:val="0"/>
+                      <w:i/>
+                      <w:sz w:val="19"/>
+                    </w:rPr>
+                    <w:t>Funcionamiento de la operación de retroceso</w:t>
+                  </w:r>
+                </w:p>
+                <w:p>
+                  <w:pPr>
+                    <w:keepNext/>
+                    <w:spacing w:after="60"/>
+                    <w:jc w:val="center"/>
+                  </w:pPr>
+                  <w:r>
+                    <w:drawing>
+                      <wp:inline distT="0" distB="0" distL="114300" distR="114300">
+                        <wp:extent cx="4114800" cy="1365885"/>
+                        <wp:effectExtent l="0" t="0" r="0" b="5715"/>
+                        <wp:docPr id="5" name="Picture 5"/>
+                        <wp:cNvGraphicFramePr>
+                          <a:graphicFrameLocks xmlns:a="http://schemas.openxmlformats.org/drawingml/2006/main" noChangeAspect="1"/>
+                        </wp:cNvGraphicFramePr>
+                        <a:graphic xmlns:a="http://schemas.openxmlformats.org/drawingml/2006/main">
+                          <a:graphicData uri="http://schemas.openxmlformats.org/drawingml/2006/picture">
+                            <pic:pic xmlns:pic="http://schemas.openxmlformats.org/drawingml/2006/picture">
+                              <pic:nvPicPr>
+                                <pic:cNvPr id="5" name="Picture 5"/>
+                                <pic:cNvPicPr>
+                                  <a:picLocks noChangeAspect="1"/>
+                                </pic:cNvPicPr>
+                              </pic:nvPicPr>
+                              <pic:blipFill>
+                                <a:blip r:embed="rId13"/>
+                                <a:stretch>
+                                  <a:fillRect/>
+                                </a:stretch>
+                              </pic:blipFill>
+                              <pic:spPr>
+                                <a:xfrm>
+                                  <a:off x="0" y="0"/>
+                                  <a:ext cx="4114800" cy="1366024"/>
+                                </a:xfrm>
+                                <a:prstGeom prst="rect">
+                                  <a:avLst/>
+                                </a:prstGeom>
+                              </pic:spPr>
+                            </pic:pic>
+                          </a:graphicData>
+                        </a:graphic>
+                      </wp:inline>
+                    </w:drawing>
+                  </w:r>
+                </w:p>
+                <w:p>
+                  <w:pPr>
+                    <w:keepLines/>
+                    <w:spacing w:after="160"/>
+                    <w:jc w:val="center"/>
+                  </w:pPr>
+                  <w:r>
+                    <w:rPr>
+                      <w:rFonts w:ascii="Book Antiqua" w:hAnsi="Book Antiqua" w:eastAsia="Book Antiqua"/>
+                      <w:b/>
+                      <w:i/>
+                      <w:sz w:val="18"/>
+                    </w:rPr>
+                    <w:t xml:space="preserve">Nota. </w:t>
+                  </w:r>
+                  <w:r>
+                    <w:rPr>
+                      <w:rFonts w:ascii="Book Antiqua" w:hAnsi="Book Antiqua" w:eastAsia="Book Antiqua"/>
+                      <w:b w:val="0"/>
+                      <w:i w:val="0"/>
+                      <w:sz w:val="18"/>
+                    </w:rPr>
+                    <w:t>La captura evidencia el retorno desde Moodle UEA hacia Microsoft Learn mediante la operación Pop de la pila. Elaboración propia (2026).</w:t>
+                  </w:r>
+                </w:p>
+              </w:tc>
+            </w:tr>
+          </w:tbl>
+          <w:p/>
+          <w:tbl>
+            <w:tblPr>
+              <w:tblStyle w:val="5"/>
+              <w:tblW w:w="6480" w:type="dxa"/>
+              <w:tblInd w:w="0" w:type="dxa"/>
+              <w:tblBorders>
+                <w:top w:val="none" w:color="auto" w:sz="0" w:space="0"/>
+                <w:left w:val="none" w:color="auto" w:sz="0" w:space="0"/>
+                <w:bottom w:val="none" w:color="auto" w:sz="0" w:space="0"/>
+                <w:right w:val="none" w:color="auto" w:sz="0" w:space="0"/>
+                <w:insideH w:val="none" w:color="auto" w:sz="0" w:space="0"/>
+                <w:insideV w:val="none" w:color="auto" w:sz="0" w:space="0"/>
+              </w:tblBorders>
+              <w:tblLayout w:type="fixed"/>
+              <w:tblCellMar>
+                <w:top w:w="0" w:type="dxa"/>
+                <w:left w:w="108" w:type="dxa"/>
+                <w:bottom w:w="0" w:type="dxa"/>
+                <w:right w:w="108" w:type="dxa"/>
+              </w:tblCellMar>
+            </w:tblPr>
+            <w:tblGrid>
+              <w:gridCol w:w="6480"/>
+            </w:tblGrid>
+            <w:tr>
+              <w:tblPrEx>
+                <w:tblBorders>
+                  <w:top w:val="none" w:color="auto" w:sz="0" w:space="0"/>
+                  <w:left w:val="none" w:color="auto" w:sz="0" w:space="0"/>
+                  <w:bottom w:val="none" w:color="auto" w:sz="0" w:space="0"/>
+                  <w:right w:val="none" w:color="auto" w:sz="0" w:space="0"/>
+                  <w:insideH w:val="none" w:color="auto" w:sz="0" w:space="0"/>
+                  <w:insideV w:val="none" w:color="auto" w:sz="0" w:space="0"/>
+                </w:tblBorders>
+                <w:tblCellMar>
+                  <w:top w:w="0" w:type="dxa"/>
+                  <w:left w:w="108" w:type="dxa"/>
+                  <w:bottom w:w="0" w:type="dxa"/>
+                  <w:right w:w="108" w:type="dxa"/>
+                </w:tblCellMar>
+              </w:tblPrEx>
+              <w:trPr>
+                <w:cantSplit/>
+              </w:trPr>
+              <w:tc>
+                <w:tcPr>
+                  <w:tcW w:w="6480" w:type="dxa"/>
+                  <w:tcMar>
+                    <w:top w:w="0" w:type="dxa"/>
+                    <w:left w:w="0" w:type="dxa"/>
+                    <w:bottom w:w="0" w:type="dxa"/>
+                    <w:right w:w="0" w:type="dxa"/>
+                  </w:tcMar>
+                </w:tcPr>
+                <w:p>
+                  <w:pPr>
+                    <w:keepNext/>
+                    <w:spacing w:before="120" w:after="0"/>
+                    <w:jc w:val="center"/>
+                  </w:pPr>
+                  <w:r>
+                    <w:rPr>
+                      <w:rFonts w:ascii="Book Antiqua" w:hAnsi="Book Antiqua" w:eastAsia="Book Antiqua"/>
+                      <w:b/>
+                      <w:i w:val="0"/>
+                      <w:sz w:val="19"/>
+                    </w:rPr>
+                    <w:t>Figura 6.</w:t>
+                  </w:r>
+                </w:p>
+                <w:p>
+                  <w:pPr>
+                    <w:keepNext/>
+                    <w:spacing w:after="60"/>
+                    <w:jc w:val="center"/>
+                  </w:pPr>
+                  <w:r>
+                    <w:rPr>
+                      <w:rFonts w:ascii="Book Antiqua" w:hAnsi="Book Antiqua" w:eastAsia="Book Antiqua"/>
+                      <w:b w:val="0"/>
+                      <w:i/>
+                      <w:sz w:val="19"/>
+                    </w:rPr>
+                    <w:t>Validación del historial de navegación vacío</w:t>
+                  </w:r>
+                </w:p>
+                <w:p>
+                  <w:pPr>
+                    <w:keepNext/>
+                    <w:spacing w:after="60"/>
+                    <w:jc w:val="center"/>
+                  </w:pPr>
+                  <w:r>
+                    <w:drawing>
+                      <wp:inline distT="0" distB="0" distL="114300" distR="114300">
+                        <wp:extent cx="4114800" cy="2556510"/>
+                        <wp:effectExtent l="0" t="0" r="0" b="15240"/>
+                        <wp:docPr id="6" name="Picture 6"/>
+                        <wp:cNvGraphicFramePr>
+                          <a:graphicFrameLocks xmlns:a="http://schemas.openxmlformats.org/drawingml/2006/main" noChangeAspect="1"/>
+                        </wp:cNvGraphicFramePr>
+                        <a:graphic xmlns:a="http://schemas.openxmlformats.org/drawingml/2006/main">
+                          <a:graphicData uri="http://schemas.openxmlformats.org/drawingml/2006/picture">
+                            <pic:pic xmlns:pic="http://schemas.openxmlformats.org/drawingml/2006/picture">
+                              <pic:nvPicPr>
+                                <pic:cNvPr id="6" name="Picture 6"/>
+                                <pic:cNvPicPr>
+                                  <a:picLocks noChangeAspect="1"/>
+                                </pic:cNvPicPr>
+                              </pic:nvPicPr>
+                              <pic:blipFill>
+                                <a:blip r:embed="rId14"/>
+                                <a:stretch>
+                                  <a:fillRect/>
+                                </a:stretch>
+                              </pic:blipFill>
+                              <pic:spPr>
+                                <a:xfrm>
+                                  <a:off x="0" y="0"/>
+                                  <a:ext cx="4114800" cy="2557135"/>
+                                </a:xfrm>
+                                <a:prstGeom prst="rect">
+                                  <a:avLst/>
+                                </a:prstGeom>
+                              </pic:spPr>
+                            </pic:pic>
+                          </a:graphicData>
+                        </a:graphic>
+                      </wp:inline>
+                    </w:drawing>
+                  </w:r>
+                </w:p>
+                <w:p>
+                  <w:pPr>
+                    <w:keepLines/>
+                    <w:spacing w:after="160"/>
+                    <w:jc w:val="center"/>
+                  </w:pPr>
+                  <w:r>
+                    <w:rPr>
+                      <w:rFonts w:ascii="Book Antiqua" w:hAnsi="Book Antiqua" w:eastAsia="Book Antiqua"/>
+                      <w:b/>
+                      <w:i/>
+                      <w:sz w:val="18"/>
+                    </w:rPr>
+                    <w:t xml:space="preserve">Nota. </w:t>
+                  </w:r>
+                  <w:r>
+                    <w:rPr>
+                      <w:rFonts w:ascii="Book Antiqua" w:hAnsi="Book Antiqua" w:eastAsia="Book Antiqua"/>
+                      <w:b w:val="0"/>
+                      <w:i w:val="0"/>
+                      <w:sz w:val="18"/>
+                    </w:rPr>
+                    <w:t>El sistema informa que no existen páginas anteriores cuando la pila se encuentra vacía. Elaboración propia (2026).</w:t>
+                  </w:r>
+                </w:p>
+              </w:tc>
+            </w:tr>
+          </w:tbl>
+          <w:p/>
           <w:p>
-            <w:pPr>
-              <w:keepNext/>
-              <w:spacing w:before="80" w:after="60"/>
-              <w:jc w:val="center"/>
-            </w:pPr>
-            <w:r>
-              <w:drawing>
-                <wp:inline distT="0" distB="0" distL="114300" distR="114300">
-                  <wp:extent cx="5440680" cy="2592705"/>
-                  <wp:effectExtent l="0" t="0" r="7620" b="17145"/>
-                  <wp:docPr id="2" name="Picture 2"/>
-                  <wp:cNvGraphicFramePr>
-                    <a:graphicFrameLocks xmlns:a="http://schemas.openxmlformats.org/drawingml/2006/main" noChangeAspect="1"/>
-                  </wp:cNvGraphicFramePr>
-                  <a:graphic xmlns:a="http://schemas.openxmlformats.org/drawingml/2006/main">
-                    <a:graphicData uri="http://schemas.openxmlformats.org/drawingml/2006/picture">
-                      <pic:pic xmlns:pic="http://schemas.openxmlformats.org/drawingml/2006/picture">
-                        <pic:nvPicPr>
-                          <pic:cNvPr id="2" name="Picture 2"/>
-                          <pic:cNvPicPr>
-                            <a:picLocks noChangeAspect="1"/>
-                          </pic:cNvPicPr>
-                        </pic:nvPicPr>
-                        <pic:blipFill>
-                          <a:blip r:embed="rId10"/>
-                          <a:stretch>
-                            <a:fillRect/>
-                          </a:stretch>
-                        </pic:blipFill>
-                        <pic:spPr>
-                          <a:xfrm>
-                            <a:off x="0" y="0"/>
-                            <a:ext cx="5440680" cy="2593005"/>
-                          </a:xfrm>
-                          <a:prstGeom prst="rect">
-                            <a:avLst/>
-                          </a:prstGeom>
-                        </pic:spPr>
-                      </pic:pic>
-                    </a:graphicData>
-                  </a:graphic>
-                </wp:inline>
-              </w:drawing>
+            <w:r>
+              <w:br w:type="page"/>
             </w:r>
           </w:p>
-          <w:p>
-            <w:pPr>
-              <w:keepLines/>
-              <w:spacing w:after="160"/>
-              <w:jc w:val="center"/>
-            </w:pPr>
-            <w:r>
-              <w:rPr>
-                <w:rFonts w:ascii="Book Antiqua" w:hAnsi="Book Antiqua" w:eastAsia="Book Antiqua"/>
-                <w:b w:val="0"/>
-                <w:i/>
-                <w:sz w:val="19"/>
-              </w:rPr>
-              <w:t>Anexo 2. Reportería del historial y orden LIFO disponible para retroceder.</w:t>
-            </w:r>
-          </w:p>
-          <w:p>
-            <w:pPr>
-              <w:keepNext/>
-              <w:spacing w:before="80" w:after="60"/>
-              <w:jc w:val="center"/>
-            </w:pPr>
-            <w:r>
-              <w:drawing>
-                <wp:inline distT="0" distB="0" distL="114300" distR="114300">
-                  <wp:extent cx="5372100" cy="2743200"/>
-                  <wp:effectExtent l="0" t="0" r="0" b="0"/>
-                  <wp:docPr id="3" name="Picture 3"/>
-                  <wp:cNvGraphicFramePr>
-                    <a:graphicFrameLocks xmlns:a="http://schemas.openxmlformats.org/drawingml/2006/main" noChangeAspect="1"/>
-                  </wp:cNvGraphicFramePr>
-                  <a:graphic xmlns:a="http://schemas.openxmlformats.org/drawingml/2006/main">
-                    <a:graphicData uri="http://schemas.openxmlformats.org/drawingml/2006/picture">
-                      <pic:pic xmlns:pic="http://schemas.openxmlformats.org/drawingml/2006/picture">
-                        <pic:nvPicPr>
-                          <pic:cNvPr id="3" name="Picture 3"/>
-                          <pic:cNvPicPr>
-                            <a:picLocks noChangeAspect="1"/>
-                          </pic:cNvPicPr>
-                        </pic:nvPicPr>
-                        <pic:blipFill>
-                          <a:blip r:embed="rId11"/>
-                          <a:stretch>
-                            <a:fillRect/>
-                          </a:stretch>
-                        </pic:blipFill>
-                        <pic:spPr>
-                          <a:xfrm>
-                            <a:off x="0" y="0"/>
-                            <a:ext cx="5372100" cy="2743200"/>
-                          </a:xfrm>
-                          <a:prstGeom prst="rect">
-                            <a:avLst/>
-                          </a:prstGeom>
-                        </pic:spPr>
-                      </pic:pic>
-                    </a:graphicData>
-                  </a:graphic>
-                </wp:inline>
-              </w:drawing>
-            </w:r>
-          </w:p>
-          <w:p>
-            <w:pPr>
-              <w:keepLines/>
-              <w:spacing w:after="160"/>
-              <w:jc w:val="center"/>
-            </w:pPr>
-            <w:r>
-              <w:rPr>
-                <w:rFonts w:ascii="Book Antiqua" w:hAnsi="Book Antiqua" w:eastAsia="Book Antiqua"/>
-                <w:b w:val="0"/>
-                <w:i/>
-                <w:sz w:val="19"/>
-              </w:rPr>
-              <w:t>Anexo 3. Consulta de Microsoft Learn dentro de la pila.</w:t>
-            </w:r>
-          </w:p>
-          <w:p>
-            <w:r>
-              <w:br w:type="page"/>
-            </w:r>
-          </w:p>
-          <w:p>
-            <w:pPr>
-              <w:keepNext/>
-              <w:spacing w:before="80" w:after="60"/>
-              <w:jc w:val="center"/>
-            </w:pPr>
-            <w:r>
-              <w:drawing>
-                <wp:inline distT="0" distB="0" distL="114300" distR="114300">
-                  <wp:extent cx="5440680" cy="2580640"/>
-                  <wp:effectExtent l="0" t="0" r="7620" b="10160"/>
-                  <wp:docPr id="4" name="Picture 4"/>
-                  <wp:cNvGraphicFramePr>
-                    <a:graphicFrameLocks xmlns:a="http://schemas.openxmlformats.org/drawingml/2006/main" noChangeAspect="1"/>
-                  </wp:cNvGraphicFramePr>
-                  <a:graphic xmlns:a="http://schemas.openxmlformats.org/drawingml/2006/main">
-                    <a:graphicData uri="http://schemas.openxmlformats.org/drawingml/2006/picture">
-                      <pic:pic xmlns:pic="http://schemas.openxmlformats.org/drawingml/2006/picture">
-                        <pic:nvPicPr>
-                          <pic:cNvPr id="4" name="Picture 4"/>
-                          <pic:cNvPicPr>
-                            <a:picLocks noChangeAspect="1"/>
-                          </pic:cNvPicPr>
-                        </pic:nvPicPr>
-                        <pic:blipFill>
-                          <a:blip r:embed="rId12"/>
-                          <a:stretch>
-                            <a:fillRect/>
-                          </a:stretch>
-                        </pic:blipFill>
-                        <pic:spPr>
-                          <a:xfrm>
-                            <a:off x="0" y="0"/>
-                            <a:ext cx="5440680" cy="2581090"/>
-                          </a:xfrm>
-                          <a:prstGeom prst="rect">
-                            <a:avLst/>
-                          </a:prstGeom>
-                        </pic:spPr>
-                      </pic:pic>
-                    </a:graphicData>
-                  </a:graphic>
-                </wp:inline>
-              </w:drawing>
-            </w:r>
-          </w:p>
-          <w:p>
-            <w:pPr>
-              <w:keepLines/>
-              <w:spacing w:after="160"/>
-              <w:jc w:val="center"/>
-            </w:pPr>
-            <w:r>
-              <w:rPr>
-                <w:rFonts w:ascii="Book Antiqua" w:hAnsi="Book Antiqua" w:eastAsia="Book Antiqua"/>
-                <w:b w:val="0"/>
-                <w:i/>
-                <w:sz w:val="19"/>
-              </w:rPr>
-              <w:t>Anexo 4. Reporte completo de las páginas visitadas.</w:t>
-            </w:r>
-          </w:p>
-          <w:p>
-            <w:r>
-              <w:br w:type="page"/>
-            </w:r>
-          </w:p>
-          <w:p>
-            <w:pPr>
-              <w:keepNext/>
-              <w:spacing w:before="80" w:after="60"/>
-              <w:jc w:val="center"/>
-            </w:pPr>
-            <w:r>
-              <w:drawing>
-                <wp:inline distT="0" distB="0" distL="114300" distR="114300">
-                  <wp:extent cx="5440680" cy="1805940"/>
-                  <wp:effectExtent l="0" t="0" r="7620" b="3810"/>
-                  <wp:docPr id="5" name="Picture 5"/>
-                  <wp:cNvGraphicFramePr>
-                    <a:graphicFrameLocks xmlns:a="http://schemas.openxmlformats.org/drawingml/2006/main" noChangeAspect="1"/>
-                  </wp:cNvGraphicFramePr>
-                  <a:graphic xmlns:a="http://schemas.openxmlformats.org/drawingml/2006/main">
-                    <a:graphicData uri="http://schemas.openxmlformats.org/drawingml/2006/picture">
-                      <pic:pic xmlns:pic="http://schemas.openxmlformats.org/drawingml/2006/picture">
-                        <pic:nvPicPr>
-                          <pic:cNvPr id="5" name="Picture 5"/>
-                          <pic:cNvPicPr>
-                            <a:picLocks noChangeAspect="1"/>
-                          </pic:cNvPicPr>
-                        </pic:nvPicPr>
-                        <pic:blipFill>
-                          <a:blip r:embed="rId13"/>
-                          <a:stretch>
-                            <a:fillRect/>
-                          </a:stretch>
-                        </pic:blipFill>
-                        <pic:spPr>
-                          <a:xfrm>
-                            <a:off x="0" y="0"/>
-                            <a:ext cx="5440680" cy="1806188"/>
-                          </a:xfrm>
-                          <a:prstGeom prst="rect">
-                            <a:avLst/>
-                          </a:prstGeom>
-                        </pic:spPr>
-                      </pic:pic>
-                    </a:graphicData>
-                  </a:graphic>
-                </wp:inline>
-              </w:drawing>
-            </w:r>
-          </w:p>
-          <w:p>
-            <w:pPr>
-              <w:keepLines/>
-              <w:spacing w:after="160"/>
-              <w:jc w:val="center"/>
-            </w:pPr>
-            <w:r>
-              <w:rPr>
-                <w:rFonts w:ascii="Book Antiqua" w:hAnsi="Book Antiqua" w:eastAsia="Book Antiqua"/>
-                <w:b w:val="0"/>
-                <w:i/>
-                <w:sz w:val="19"/>
-              </w:rPr>
-              <w:t>Anexo 5. Primer retroceso desde Moodle UEA hacia Microsoft Learn.</w:t>
-            </w:r>
-          </w:p>
-          <w:p>
-            <w:pPr>
-              <w:keepNext/>
-              <w:spacing w:before="80" w:after="60"/>
-              <w:jc w:val="center"/>
-            </w:pPr>
-            <w:r>
-              <w:drawing>
-                <wp:inline distT="0" distB="0" distL="114300" distR="114300">
-                  <wp:extent cx="5440680" cy="3380740"/>
-                  <wp:effectExtent l="0" t="0" r="7620" b="10160"/>
-                  <wp:docPr id="6" name="Picture 6"/>
-                  <wp:cNvGraphicFramePr>
-                    <a:graphicFrameLocks xmlns:a="http://schemas.openxmlformats.org/drawingml/2006/main" noChangeAspect="1"/>
-                  </wp:cNvGraphicFramePr>
-                  <a:graphic xmlns:a="http://schemas.openxmlformats.org/drawingml/2006/main">
-                    <a:graphicData uri="http://schemas.openxmlformats.org/drawingml/2006/picture">
-                      <pic:pic xmlns:pic="http://schemas.openxmlformats.org/drawingml/2006/picture">
-                        <pic:nvPicPr>
-                          <pic:cNvPr id="6" name="Picture 6"/>
-                          <pic:cNvPicPr>
-                            <a:picLocks noChangeAspect="1"/>
-                          </pic:cNvPicPr>
-                        </pic:nvPicPr>
-                        <pic:blipFill>
-                          <a:blip r:embed="rId14"/>
-                          <a:stretch>
-                            <a:fillRect/>
-                          </a:stretch>
-                        </pic:blipFill>
-                        <pic:spPr>
-                          <a:xfrm>
-                            <a:off x="0" y="0"/>
-                            <a:ext cx="5440680" cy="3381101"/>
-                          </a:xfrm>
-                          <a:prstGeom prst="rect">
-                            <a:avLst/>
-                          </a:prstGeom>
-                        </pic:spPr>
-                      </pic:pic>
-                    </a:graphicData>
-                  </a:graphic>
-                </wp:inline>
-              </w:drawing>
-            </w:r>
-          </w:p>
-          <w:p>
-            <w:pPr>
-              <w:keepLines/>
-              <w:spacing w:after="160"/>
-              <w:jc w:val="center"/>
-            </w:pPr>
-            <w:r>
-              <w:rPr>
-                <w:rFonts w:ascii="Book Antiqua" w:hAnsi="Book Antiqua" w:eastAsia="Book Antiqua"/>
-                <w:b w:val="0"/>
-                <w:i/>
-                <w:sz w:val="19"/>
-              </w:rPr>
-              <w:t>Anexo 6. Secuencia de retrocesos y validación de la pila vacía.</w:t>
-            </w:r>
-          </w:p>
-          <w:p>
-            <w:r>
-              <w:br w:type="page"/>
-            </w:r>
-          </w:p>
-          <w:p>
-            <w:pPr>
-              <w:keepNext/>
-              <w:spacing w:before="80" w:after="60"/>
-              <w:jc w:val="center"/>
-            </w:pPr>
-            <w:r>
-              <w:drawing>
-                <wp:inline distT="0" distB="0" distL="114300" distR="114300">
-                  <wp:extent cx="4494530" cy="2925445"/>
-                  <wp:effectExtent l="0" t="0" r="1270" b="8255"/>
-                  <wp:docPr id="7" name="Picture 7"/>
-                  <wp:cNvGraphicFramePr>
-                    <a:graphicFrameLocks xmlns:a="http://schemas.openxmlformats.org/drawingml/2006/main" noChangeAspect="1"/>
-                  </wp:cNvGraphicFramePr>
-                  <a:graphic xmlns:a="http://schemas.openxmlformats.org/drawingml/2006/main">
-                    <a:graphicData uri="http://schemas.openxmlformats.org/drawingml/2006/picture">
-                      <pic:pic xmlns:pic="http://schemas.openxmlformats.org/drawingml/2006/picture">
-                        <pic:nvPicPr>
-                          <pic:cNvPr id="7" name="Picture 7"/>
-                          <pic:cNvPicPr>
-                            <a:picLocks noChangeAspect="1"/>
-                          </pic:cNvPicPr>
-                        </pic:nvPicPr>
-                        <pic:blipFill>
-                          <a:blip r:embed="rId15"/>
-                          <a:stretch>
-                            <a:fillRect/>
-                          </a:stretch>
-                        </pic:blipFill>
-                        <pic:spPr>
-                          <a:xfrm>
-                            <a:off x="0" y="0"/>
-                            <a:ext cx="4494997" cy="2926079"/>
-                          </a:xfrm>
-                          <a:prstGeom prst="rect">
-                            <a:avLst/>
-                          </a:prstGeom>
-                        </pic:spPr>
-                      </pic:pic>
-                    </a:graphicData>
-                  </a:graphic>
-                </wp:inline>
-              </w:drawing>
-            </w:r>
-          </w:p>
-          <w:p>
-            <w:pPr>
-              <w:keepLines/>
-              <w:spacing w:after="160"/>
-              <w:jc w:val="center"/>
-            </w:pPr>
-            <w:r>
-              <w:rPr>
-                <w:rFonts w:ascii="Book Antiqua" w:hAnsi="Book Antiqua" w:eastAsia="Book Antiqua"/>
-                <w:b w:val="0"/>
-                <w:i/>
-                <w:sz w:val="19"/>
-              </w:rPr>
-              <w:t>Anexo 7. Salida controlada del programa.</w:t>
-            </w:r>
-          </w:p>
+          <w:tbl>
+            <w:tblPr>
+              <w:tblStyle w:val="5"/>
+              <w:tblW w:w="6480" w:type="dxa"/>
+              <w:tblInd w:w="0" w:type="dxa"/>
+              <w:tblBorders>
+                <w:top w:val="none" w:color="auto" w:sz="0" w:space="0"/>
+                <w:left w:val="none" w:color="auto" w:sz="0" w:space="0"/>
+                <w:bottom w:val="none" w:color="auto" w:sz="0" w:space="0"/>
+                <w:right w:val="none" w:color="auto" w:sz="0" w:space="0"/>
+                <w:insideH w:val="none" w:color="auto" w:sz="0" w:space="0"/>
+                <w:insideV w:val="none" w:color="auto" w:sz="0" w:space="0"/>
+              </w:tblBorders>
+              <w:tblLayout w:type="fixed"/>
+              <w:tblCellMar>
+                <w:top w:w="0" w:type="dxa"/>
+                <w:left w:w="108" w:type="dxa"/>
+                <w:bottom w:w="0" w:type="dxa"/>
+                <w:right w:w="108" w:type="dxa"/>
+              </w:tblCellMar>
+            </w:tblPr>
+            <w:tblGrid>
+              <w:gridCol w:w="6480"/>
+            </w:tblGrid>
+            <w:tr>
+              <w:tblPrEx>
+                <w:tblBorders>
+                  <w:top w:val="none" w:color="auto" w:sz="0" w:space="0"/>
+                  <w:left w:val="none" w:color="auto" w:sz="0" w:space="0"/>
+                  <w:bottom w:val="none" w:color="auto" w:sz="0" w:space="0"/>
+                  <w:right w:val="none" w:color="auto" w:sz="0" w:space="0"/>
+                  <w:insideH w:val="none" w:color="auto" w:sz="0" w:space="0"/>
+                  <w:insideV w:val="none" w:color="auto" w:sz="0" w:space="0"/>
+                </w:tblBorders>
+                <w:tblCellMar>
+                  <w:top w:w="0" w:type="dxa"/>
+                  <w:left w:w="108" w:type="dxa"/>
+                  <w:bottom w:w="0" w:type="dxa"/>
+                  <w:right w:w="108" w:type="dxa"/>
+                </w:tblCellMar>
+              </w:tblPrEx>
+              <w:trPr>
+                <w:cantSplit/>
+              </w:trPr>
+              <w:tc>
+                <w:tcPr>
+                  <w:tcW w:w="6480" w:type="dxa"/>
+                  <w:tcMar>
+                    <w:top w:w="0" w:type="dxa"/>
+                    <w:left w:w="0" w:type="dxa"/>
+                    <w:bottom w:w="0" w:type="dxa"/>
+                    <w:right w:w="0" w:type="dxa"/>
+                  </w:tcMar>
+                </w:tcPr>
+                <w:p>
+                  <w:pPr>
+                    <w:keepNext/>
+                    <w:spacing w:before="120" w:after="0"/>
+                    <w:jc w:val="center"/>
+                  </w:pPr>
+                  <w:r>
+                    <w:rPr>
+                      <w:rFonts w:ascii="Book Antiqua" w:hAnsi="Book Antiqua" w:eastAsia="Book Antiqua"/>
+                      <w:b/>
+                      <w:i w:val="0"/>
+                      <w:sz w:val="19"/>
+                    </w:rPr>
+                    <w:t>Figura 7.</w:t>
+                  </w:r>
+                </w:p>
+                <w:p>
+                  <w:pPr>
+                    <w:keepNext/>
+                    <w:spacing w:after="60"/>
+                    <w:jc w:val="center"/>
+                  </w:pPr>
+                  <w:r>
+                    <w:rPr>
+                      <w:rFonts w:ascii="Book Antiqua" w:hAnsi="Book Antiqua" w:eastAsia="Book Antiqua"/>
+                      <w:b w:val="0"/>
+                      <w:i/>
+                      <w:sz w:val="19"/>
+                    </w:rPr>
+                    <w:t>Finalización correcta de la aplicación</w:t>
+                  </w:r>
+                </w:p>
+                <w:p>
+                  <w:pPr>
+                    <w:keepNext/>
+                    <w:spacing w:after="60"/>
+                    <w:jc w:val="center"/>
+                  </w:pPr>
+                  <w:r>
+                    <w:drawing>
+                      <wp:inline distT="0" distB="0" distL="114300" distR="114300">
+                        <wp:extent cx="4114800" cy="2678430"/>
+                        <wp:effectExtent l="0" t="0" r="0" b="7620"/>
+                        <wp:docPr id="7" name="Picture 7"/>
+                        <wp:cNvGraphicFramePr>
+                          <a:graphicFrameLocks xmlns:a="http://schemas.openxmlformats.org/drawingml/2006/main" noChangeAspect="1"/>
+                        </wp:cNvGraphicFramePr>
+                        <a:graphic xmlns:a="http://schemas.openxmlformats.org/drawingml/2006/main">
+                          <a:graphicData uri="http://schemas.openxmlformats.org/drawingml/2006/picture">
+                            <pic:pic xmlns:pic="http://schemas.openxmlformats.org/drawingml/2006/picture">
+                              <pic:nvPicPr>
+                                <pic:cNvPr id="7" name="Picture 7"/>
+                                <pic:cNvPicPr>
+                                  <a:picLocks noChangeAspect="1"/>
+                                </pic:cNvPicPr>
+                              </pic:nvPicPr>
+                              <pic:blipFill>
+                                <a:blip r:embed="rId15"/>
+                                <a:stretch>
+                                  <a:fillRect/>
+                                </a:stretch>
+                              </pic:blipFill>
+                              <pic:spPr>
+                                <a:xfrm>
+                                  <a:off x="0" y="0"/>
+                                  <a:ext cx="4114800" cy="2678585"/>
+                                </a:xfrm>
+                                <a:prstGeom prst="rect">
+                                  <a:avLst/>
+                                </a:prstGeom>
+                              </pic:spPr>
+                            </pic:pic>
+                          </a:graphicData>
+                        </a:graphic>
+                      </wp:inline>
+                    </w:drawing>
+                  </w:r>
+                </w:p>
+                <w:p>
+                  <w:pPr>
+                    <w:keepLines/>
+                    <w:spacing w:after="160"/>
+                    <w:jc w:val="center"/>
+                  </w:pPr>
+                  <w:r>
+                    <w:rPr>
+                      <w:rFonts w:ascii="Book Antiqua" w:hAnsi="Book Antiqua" w:eastAsia="Book Antiqua"/>
+                      <w:b/>
+                      <w:i/>
+                      <w:sz w:val="18"/>
+                    </w:rPr>
+                    <w:t xml:space="preserve">Nota. </w:t>
+                  </w:r>
+                  <w:r>
+                    <w:rPr>
+                      <w:rFonts w:ascii="Book Antiqua" w:hAnsi="Book Antiqua" w:eastAsia="Book Antiqua"/>
+                      <w:b w:val="0"/>
+                      <w:i w:val="0"/>
+                      <w:sz w:val="18"/>
+                    </w:rPr>
+                    <w:t>Captura de la opción de salida y del cierre controlado del programa. Elaboración propia en Visual Studio Code (2026).</w:t>
+                  </w:r>
+                </w:p>
+              </w:tc>
+            </w:tr>
+          </w:tbl>
+          <w:p/>
           <w:p>
             <w:pPr>
               <w:spacing w:before="80" w:after="80" w:line="240" w:lineRule="auto"/>
@@ -6672,7 +7365,7 @@
         <w:sz w:val="24"/>
         <w:szCs w:val="24"/>
       </w:rPr>
-      <w:t>11</w:t>
+      <w:t>5</w:t>
     </w:r>
     <w:r>
       <w:rPr>
@@ -6780,7 +7473,7 @@
     <w:lsdException w:uiPriority="99" w:name="Normal Indent"/>
     <w:lsdException w:qFormat="1" w:uiPriority="99" w:name="footnote text"/>
     <w:lsdException w:uiPriority="99" w:name="annotation text"/>
-    <w:lsdException w:qFormat="1" w:uiPriority="99" w:semiHidden="0" w:name="header"/>
+    <w:lsdException w:uiPriority="99" w:semiHidden="0" w:name="header"/>
     <w:lsdException w:qFormat="1" w:uiPriority="99" w:semiHidden="0" w:name="footer"/>
     <w:lsdException w:uiPriority="99" w:name="index heading"/>
     <w:lsdException w:qFormat="1" w:uiPriority="35" w:name="caption"/>
@@ -7038,7 +7731,6 @@
     <w:basedOn w:val="1"/>
     <w:link w:val="13"/>
     <w:unhideWhenUsed/>
-    <w:qFormat/>
     <w:uiPriority w:val="99"/>
     <w:pPr>
       <w:tabs>
@@ -7159,6 +7851,7 @@
     <w:name w:val="Título 3 Car"/>
     <w:link w:val="3"/>
     <w:semiHidden/>
+    <w:qFormat/>
     <w:uiPriority w:val="9"/>
     <w:rPr>
       <w:rFonts w:ascii="Calibri Light" w:hAnsi="Calibri Light" w:eastAsia="Times New Roman" w:cs="Times New Roman"/>
@@ -7170,16 +7863,19 @@
   <w:style w:type="character" w:customStyle="1" w:styleId="21">
     <w:name w:val="gd"/>
     <w:basedOn w:val="4"/>
+    <w:qFormat/>
     <w:uiPriority w:val="0"/>
   </w:style>
   <w:style w:type="character" w:customStyle="1" w:styleId="22">
     <w:name w:val="g3"/>
     <w:basedOn w:val="4"/>
+    <w:qFormat/>
     <w:uiPriority w:val="0"/>
   </w:style>
   <w:style w:type="character" w:customStyle="1" w:styleId="23">
     <w:name w:val="hb"/>
     <w:basedOn w:val="4"/>
+    <w:qFormat/>
     <w:uiPriority w:val="0"/>
   </w:style>
   <w:style w:type="character" w:customStyle="1" w:styleId="24">
@@ -7202,6 +7898,7 @@
     <w:name w:val="Texto nota pie Car"/>
     <w:link w:val="8"/>
     <w:semiHidden/>
+    <w:qFormat/>
     <w:uiPriority w:val="99"/>
     <w:rPr>
       <w:sz w:val="20"/>

</xml_diff>